<commit_message>
Freeze for v1.0.3: archive superseded drafts, cite Zenodo concept DOI with release tag, cover-letter date, README pointers
Co-Authored-By: Claude Opus 5 <noreply@anthropic.com>
</commit_message>
<xml_diff>
--- a/outputs/research/manuscript/docx/cover_letter_nature_energy.docx
+++ b/outputs/research/manuscript/docx/cover_letter_nature_energy.docx
@@ -16,7 +16,7 @@
         <w:pStyle w:val="FirstParagraph"/>
       </w:pPr>
       <w:r>
-        <w:t xml:space="preserve">[Date]</w:t>
+        <w:t xml:space="preserve">17 September 2026</w:t>
       </w:r>
     </w:p>
     <w:p>
@@ -119,7 +119,7 @@
         <w:pStyle w:val="BodyText"/>
       </w:pPr>
       <w:r>
-        <w:t xml:space="preserve">All data are public and are listed with sources, versions, checksums and licences in the Supplementary Information; the code and verification records are public on GitHub and archived on Zenodo (https://doi.org/10.5281/zenodo.22804057). The manuscript states the evidence basis and limitations of every input, in particular that hourly provincial load shapes are reconstructions checked against published peaks and that the islanded case is a bounding assumption. The work is not under consideration elsewhere. A companion article in Chinese, which shares the model and data with this manuscript and focuses on time-of-use tariff design for Chinese provincial markets, is being prepared for a Chinese-language journal; it cites this manuscript, and we will inform the editors of its status. The authors declare no competing interests. Should the editors consider the manuscript better suited to</w:t>
+        <w:t xml:space="preserve">All data are public and are listed with sources, versions, checksums and licences in the Supplementary Information; the code and verification records are public on GitHub and archived on Zenodo (https://doi.org/10.5281/zenodo.22803800, release v1.0.3). The manuscript states the evidence basis and limitations of every input, in particular that hourly provincial load shapes are reconstructions checked against published peaks and that the islanded case is a bounding assumption. The work is not under consideration elsewhere. A companion article in Chinese, which shares the model and data with this manuscript and focuses on time-of-use tariff design for Chinese provincial markets, is being prepared for a Chinese-language journal; it cites this manuscript, and we will inform the editors of its status. The authors declare no competing interests. Should the editors consider the manuscript better suited to</w:t>
       </w:r>
       <w:r>
         <w:t xml:space="preserve"> </w:t>

</xml_diff>